<commit_message>
Added user stories and requirement traceability documents
</commit_message>
<xml_diff>
--- a/Susmita Sharma/Week 4/trip BRD.docx
+++ b/Susmita Sharma/Week 4/trip BRD.docx
@@ -49,8 +49,6 @@
           <w:szCs w:val="24"/>
         </w:rPr>
       </w:pPr>
-      <w:bookmarkStart w:id="0" w:name="_GoBack"/>
-      <w:bookmarkEnd w:id="0"/>
       <w:r>
         <w:rPr>
           <w:rFonts w:ascii="Times New Roman" w:eastAsia="Times New Roman" w:hAnsi="Times New Roman" w:cs="Times New Roman"/>
@@ -1030,6 +1028,14 @@
       <w:tblPr>
         <w:tblW w:w="0" w:type="auto"/>
         <w:tblCellSpacing w:w="15" w:type="dxa"/>
+        <w:tblBorders>
+          <w:top w:val="single" w:sz="4" w:space="0" w:color="auto"/>
+          <w:left w:val="single" w:sz="4" w:space="0" w:color="auto"/>
+          <w:bottom w:val="single" w:sz="4" w:space="0" w:color="auto"/>
+          <w:right w:val="single" w:sz="4" w:space="0" w:color="auto"/>
+          <w:insideH w:val="single" w:sz="4" w:space="0" w:color="auto"/>
+          <w:insideV w:val="single" w:sz="4" w:space="0" w:color="auto"/>
+        </w:tblBorders>
         <w:tblCellMar>
           <w:top w:w="15" w:type="dxa"/>
           <w:left w:w="15" w:type="dxa"/>
@@ -1039,8 +1045,8 @@
         <w:tblLook w:val="04A0" w:firstRow="1" w:lastRow="0" w:firstColumn="1" w:lastColumn="0" w:noHBand="0" w:noVBand="1"/>
       </w:tblPr>
       <w:tblGrid>
-        <w:gridCol w:w="1782"/>
-        <w:gridCol w:w="7034"/>
+        <w:gridCol w:w="1802"/>
+        <w:gridCol w:w="7054"/>
       </w:tblGrid>
       <w:tr>
         <w:trPr>
@@ -1750,6 +1756,7 @@
           <w:sz w:val="24"/>
           <w:szCs w:val="24"/>
         </w:rPr>
+        <w:lastRenderedPageBreak/>
         <w:pict>
           <v:rect id="_x0000_i1026" style="width:0;height:1.5pt" o:hralign="center" o:hrstd="t" o:hr="t" fillcolor="#a0a0a0" stroked="f"/>
         </w:pict>
@@ -1777,7 +1784,6 @@
           <w:sz w:val="48"/>
           <w:szCs w:val="48"/>
         </w:rPr>
-        <w:lastRenderedPageBreak/>
         <w:t>5. Business Requirements</w:t>
       </w:r>
     </w:p>
@@ -3552,6 +3558,7 @@
                 <w:sz w:val="24"/>
                 <w:szCs w:val="24"/>
               </w:rPr>
+              <w:lastRenderedPageBreak/>
               <w:t>FR-11</w:t>
             </w:r>
           </w:p>
@@ -3703,7 +3710,6 @@
           <w:sz w:val="24"/>
           <w:szCs w:val="24"/>
         </w:rPr>
-        <w:lastRenderedPageBreak/>
         <w:pict>
           <v:rect id="_x0000_i1028" style="width:0;height:1.5pt" o:hralign="center" o:hrstd="t" o:hr="t" fillcolor="#a0a0a0" stroked="f"/>
         </w:pict>
@@ -4789,11 +4795,21 @@
         </w:rPr>
         <w:t>8. User Requirements</w:t>
       </w:r>
+      <w:bookmarkStart w:id="0" w:name="_GoBack"/>
+      <w:bookmarkEnd w:id="0"/>
     </w:p>
     <w:tbl>
       <w:tblPr>
         <w:tblW w:w="0" w:type="auto"/>
         <w:tblCellSpacing w:w="15" w:type="dxa"/>
+        <w:tblBorders>
+          <w:top w:val="single" w:sz="4" w:space="0" w:color="auto"/>
+          <w:left w:val="single" w:sz="4" w:space="0" w:color="auto"/>
+          <w:bottom w:val="single" w:sz="4" w:space="0" w:color="auto"/>
+          <w:right w:val="single" w:sz="4" w:space="0" w:color="auto"/>
+          <w:insideH w:val="single" w:sz="4" w:space="0" w:color="auto"/>
+          <w:insideV w:val="single" w:sz="4" w:space="0" w:color="auto"/>
+        </w:tblBorders>
         <w:tblCellMar>
           <w:top w:w="15" w:type="dxa"/>
           <w:left w:w="15" w:type="dxa"/>
@@ -4803,8 +4819,8 @@
         <w:tblLook w:val="04A0" w:firstRow="1" w:lastRow="0" w:firstColumn="1" w:lastColumn="0" w:noHBand="0" w:noVBand="1"/>
       </w:tblPr>
       <w:tblGrid>
-        <w:gridCol w:w="729"/>
-        <w:gridCol w:w="7314"/>
+        <w:gridCol w:w="749"/>
+        <w:gridCol w:w="7334"/>
       </w:tblGrid>
       <w:tr>
         <w:trPr>
@@ -5337,6 +5353,7 @@
                 <w:sz w:val="24"/>
                 <w:szCs w:val="24"/>
               </w:rPr>
+              <w:lastRenderedPageBreak/>
               <w:t>UR-09</w:t>
             </w:r>
           </w:p>
@@ -5469,7 +5486,6 @@
                 <w:sz w:val="24"/>
                 <w:szCs w:val="24"/>
               </w:rPr>
-              <w:lastRenderedPageBreak/>
               <w:t>ID</w:t>
             </w:r>
           </w:p>
@@ -6755,6 +6771,7 @@
                 <w:sz w:val="24"/>
                 <w:szCs w:val="24"/>
               </w:rPr>
+              <w:lastRenderedPageBreak/>
               <w:t>BRL-06</w:t>
             </w:r>
           </w:p>
@@ -6878,7 +6895,6 @@
                 <w:sz w:val="24"/>
                 <w:szCs w:val="24"/>
               </w:rPr>
-              <w:lastRenderedPageBreak/>
               <w:t>Step</w:t>
             </w:r>
           </w:p>
@@ -8304,6 +8320,7 @@
           <w:sz w:val="36"/>
           <w:szCs w:val="36"/>
         </w:rPr>
+        <w:lastRenderedPageBreak/>
         <w:t>12.2 Out of Scope</w:t>
       </w:r>
     </w:p>
@@ -8587,7 +8604,6 @@
                 <w:sz w:val="24"/>
                 <w:szCs w:val="24"/>
               </w:rPr>
-              <w:lastRenderedPageBreak/>
               <w:t>4</w:t>
             </w:r>
           </w:p>
@@ -9887,6 +9903,7 @@
           <w:sz w:val="24"/>
           <w:szCs w:val="24"/>
         </w:rPr>
+        <w:lastRenderedPageBreak/>
         <w:pict>
           <v:rect id="_x0000_i1036" style="width:0;height:1.5pt" o:hralign="center" o:hrstd="t" o:hr="t" fillcolor="#a0a0a0" stroked="f"/>
         </w:pict>
@@ -9974,7 +9991,6 @@
                 <w:sz w:val="24"/>
                 <w:szCs w:val="24"/>
               </w:rPr>
-              <w:lastRenderedPageBreak/>
               <w:t>ID</w:t>
             </w:r>
           </w:p>
@@ -11532,6 +11548,7 @@
                 <w:sz w:val="24"/>
                 <w:szCs w:val="24"/>
               </w:rPr>
+              <w:lastRenderedPageBreak/>
               <w:t>TR-09</w:t>
             </w:r>
           </w:p>
@@ -11710,7 +11727,6 @@
           <w:sz w:val="48"/>
           <w:szCs w:val="48"/>
         </w:rPr>
-        <w:lastRenderedPageBreak/>
         <w:t>17. Acceptance Criteria</w:t>
       </w:r>
     </w:p>
@@ -13287,6 +13303,7 @@
                 <w:sz w:val="24"/>
                 <w:szCs w:val="24"/>
               </w:rPr>
+              <w:lastRenderedPageBreak/>
               <w:t>Role</w:t>
             </w:r>
           </w:p>
@@ -13512,7 +13529,6 @@
                 <w:sz w:val="24"/>
                 <w:szCs w:val="24"/>
               </w:rPr>
-              <w:lastRenderedPageBreak/>
               <w:t>Data Analyst</w:t>
             </w:r>
           </w:p>
@@ -15273,6 +15289,7 @@
           <w:sz w:val="48"/>
           <w:szCs w:val="48"/>
         </w:rPr>
+        <w:lastRenderedPageBreak/>
         <w:t>22. Approval and Sign-Off</w:t>
       </w:r>
     </w:p>
@@ -15332,7 +15349,6 @@
                 <w:sz w:val="24"/>
                 <w:szCs w:val="24"/>
               </w:rPr>
-              <w:lastRenderedPageBreak/>
               <w:t>Role</w:t>
             </w:r>
           </w:p>

</xml_diff>